<commit_message>
added scale and rotate functions
</commit_message>
<xml_diff>
--- a/Project Report in Progress.docx
+++ b/Project Report in Progress.docx
@@ -2233,6 +2233,9 @@
     <w:p/>
     <w:p>
       <w:r>
+        <w:rPr>
+          <w:noProof/>
+        </w:rPr>
         <w:drawing>
           <wp:inline distT="0" distB="0" distL="0" distR="0" wp14:anchorId="58FE85DD" wp14:editId="501DA7FD">
             <wp:extent cx="5563376" cy="4058216"/>
@@ -2297,6 +2300,123 @@
       <w:proofErr w:type="spellEnd"/>
       <w:r>
         <w:t xml:space="preserve"> 358 tracking and motion</w:t>
+      </w:r>
+    </w:p>
+    <w:p/>
+    <w:p>
+      <w:r>
+        <w:t xml:space="preserve">Z. Zhang and H. Shang, "Low-cost Solution for Vision-based Robotic Grasping," 2021 International Conference on Networking Systems of AI (INSAI), Shanghai, China, 2021, pp. 54-61, </w:t>
+      </w:r>
+      <w:proofErr w:type="spellStart"/>
+      <w:r>
+        <w:t>doi</w:t>
+      </w:r>
+      <w:proofErr w:type="spellEnd"/>
+      <w:r>
+        <w:t xml:space="preserve">: 10.1109/INSAI54028.2021.00022. keywords: {Location </w:t>
+      </w:r>
+      <w:proofErr w:type="spellStart"/>
+      <w:r>
+        <w:t>awareness;Service</w:t>
+      </w:r>
+      <w:proofErr w:type="spellEnd"/>
+      <w:r>
+        <w:t xml:space="preserve"> </w:t>
+      </w:r>
+      <w:proofErr w:type="spellStart"/>
+      <w:r>
+        <w:t>robots;Shape;Machine</w:t>
+      </w:r>
+      <w:proofErr w:type="spellEnd"/>
+      <w:r>
+        <w:t xml:space="preserve"> </w:t>
+      </w:r>
+      <w:proofErr w:type="spellStart"/>
+      <w:r>
+        <w:t>vision;Pose</w:t>
+      </w:r>
+      <w:proofErr w:type="spellEnd"/>
+      <w:r>
+        <w:t xml:space="preserve"> </w:t>
+      </w:r>
+      <w:proofErr w:type="spellStart"/>
+      <w:r>
+        <w:t>estimation;Grasping;Object</w:t>
+      </w:r>
+      <w:proofErr w:type="spellEnd"/>
+      <w:r>
+        <w:t xml:space="preserve"> </w:t>
+      </w:r>
+      <w:proofErr w:type="spellStart"/>
+      <w:r>
+        <w:t>detection;robotic</w:t>
+      </w:r>
+      <w:proofErr w:type="spellEnd"/>
+      <w:r>
+        <w:t xml:space="preserve"> </w:t>
+      </w:r>
+      <w:proofErr w:type="spellStart"/>
+      <w:r>
+        <w:t>grasping;machine</w:t>
+      </w:r>
+      <w:proofErr w:type="spellEnd"/>
+      <w:r>
+        <w:t xml:space="preserve"> </w:t>
+      </w:r>
+      <w:proofErr w:type="spellStart"/>
+      <w:r>
+        <w:t>vision;object</w:t>
+      </w:r>
+      <w:proofErr w:type="spellEnd"/>
+      <w:r>
+        <w:t xml:space="preserve"> </w:t>
+      </w:r>
+      <w:proofErr w:type="spellStart"/>
+      <w:r>
+        <w:t>localization;template</w:t>
+      </w:r>
+      <w:proofErr w:type="spellEnd"/>
+      <w:r>
+        <w:t xml:space="preserve"> matching},</w:t>
+      </w:r>
+    </w:p>
+    <w:p>
+      <w:r>
+        <w:drawing>
+          <wp:inline distT="0" distB="0" distL="0" distR="0" wp14:anchorId="1686873D" wp14:editId="3A598653">
+            <wp:extent cx="5731510" cy="5087620"/>
+            <wp:effectExtent l="0" t="0" r="2540" b="0"/>
+            <wp:docPr id="46248312" name="Picture 1" descr="A screenshot of a computer&#10;&#10;Description automatically generated"/>
+            <wp:cNvGraphicFramePr>
+              <a:graphicFrameLocks xmlns:a="http://schemas.openxmlformats.org/drawingml/2006/main" noChangeAspect="1"/>
+            </wp:cNvGraphicFramePr>
+            <a:graphic xmlns:a="http://schemas.openxmlformats.org/drawingml/2006/main">
+              <a:graphicData uri="http://schemas.openxmlformats.org/drawingml/2006/picture">
+                <pic:pic xmlns:pic="http://schemas.openxmlformats.org/drawingml/2006/picture">
+                  <pic:nvPicPr>
+                    <pic:cNvPr id="46248312" name="Picture 1" descr="A screenshot of a computer&#10;&#10;Description automatically generated"/>
+                    <pic:cNvPicPr/>
+                  </pic:nvPicPr>
+                  <pic:blipFill>
+                    <a:blip r:embed="rId17"/>
+                    <a:stretch>
+                      <a:fillRect/>
+                    </a:stretch>
+                  </pic:blipFill>
+                  <pic:spPr>
+                    <a:xfrm>
+                      <a:off x="0" y="0"/>
+                      <a:ext cx="5731510" cy="5087620"/>
+                    </a:xfrm>
+                    <a:prstGeom prst="rect">
+                      <a:avLst/>
+                    </a:prstGeom>
+                  </pic:spPr>
+                </pic:pic>
+              </a:graphicData>
+            </a:graphic>
+          </wp:inline>
+        </w:drawing>
       </w:r>
     </w:p>
     <w:sectPr>

</xml_diff>

<commit_message>
report progress and removed rot checks
</commit_message>
<xml_diff>
--- a/Project Report in Progress.docx
+++ b/Project Report in Progress.docx
@@ -2018,7 +2018,148 @@
     </w:p>
     <w:p>
       <w:r>
-        <w:t>One of the main sections of the project was the image comparison and matching code that would allow the robot to confirm it had found the correct target.</w:t>
+        <w:t xml:space="preserve">A main feature of this product is the ability to recognise the target image in the environment, as such the image matching code was very important. </w:t>
+      </w:r>
+    </w:p>
+    <w:p>
+      <w:r>
+        <w:t xml:space="preserve">Template matching was the simplest to implement as a starting point. </w:t>
+      </w:r>
+      <w:r>
+        <w:t xml:space="preserve">Template matching is an </w:t>
+      </w:r>
+      <w:r>
+        <w:t>OpenCV</w:t>
+      </w:r>
+      <w:r>
+        <w:t xml:space="preserve"> function that slides a template</w:t>
+      </w:r>
+      <w:r>
+        <w:t xml:space="preserve"> </w:t>
+      </w:r>
+      <w:r>
+        <w:t>(INCLUDE HOW TEMPLATE MATCHING WORKS HERE)</w:t>
+      </w:r>
+    </w:p>
+    <w:p>
+      <w:r>
+        <w:t>‘’’’</w:t>
+      </w:r>
+    </w:p>
+    <w:p>
+      <w:r>
+        <w:t>The template image is slid across the source image, one pixel at a time. At each position, a metric is calculated to measure how well the template matches that area of the source image. These metrics are stored in a result matrix, where the brightest locations (or darkest, depending on the method) indicate the best matches.</w:t>
+      </w:r>
+    </w:p>
+    <w:p>
+      <w:r>
+        <w:t>The function `</w:t>
+      </w:r>
+      <w:proofErr w:type="spellStart"/>
+      <w:r>
+        <w:t>minMaxLoc</w:t>
+      </w:r>
+      <w:proofErr w:type="spellEnd"/>
+      <w:r>
+        <w:t>()` is then used to find the highest (or lowest) value in the result matrix, identifying the location of the best match</w:t>
+      </w:r>
+    </w:p>
+    <w:p>
+      <w:r>
+        <w:t>OpenCV's `</w:t>
+      </w:r>
+      <w:proofErr w:type="spellStart"/>
+      <w:r>
+        <w:t>matchTemplate</w:t>
+      </w:r>
+      <w:proofErr w:type="spellEnd"/>
+      <w:r>
+        <w:t>()` function offers six matching methods: `TM_SQDIFF`, `TM_SQDIFF_NORMED`, `TM_CCORR`, `TM_CCORR_NORMED`, `TM_CCOEFF`, and `TM_CCOEFF_NORMED`</w:t>
+      </w:r>
+    </w:p>
+    <w:p>
+      <w:r>
+        <w:t>‘’’’</w:t>
+      </w:r>
+    </w:p>
+    <w:p>
+      <w:r>
+        <w:lastRenderedPageBreak/>
+        <w:t xml:space="preserve">Initially the template image and image including the template was a big black X on a white sheet of paper, chosen with the understanding that the high contrast and simple shape would make the code simpler and cleaner. This </w:t>
+      </w:r>
+      <w:r>
+        <w:t xml:space="preserve">did </w:t>
+      </w:r>
+      <w:r>
+        <w:t>allow</w:t>
+      </w:r>
+      <w:r>
+        <w:t xml:space="preserve"> </w:t>
+      </w:r>
+      <w:r>
+        <w:t>the image to be found easily however it also introduced more false positives in the surrounding environment</w:t>
+      </w:r>
+      <w:r>
+        <w:t>. it</w:t>
+      </w:r>
+      <w:r>
+        <w:t xml:space="preserve"> was very difficult to narrow the accuracy threshold</w:t>
+      </w:r>
+      <w:r>
+        <w:t xml:space="preserve"> to a point where the shape would still be found and false positives where uncommon</w:t>
+      </w:r>
+      <w:r>
+        <w:t>. So a new template image of a simple cat face was used from this point onwards.</w:t>
+      </w:r>
+      <w:r>
+        <w:t xml:space="preserve"> The more complex template meant the environment was unlikely to contain the template. This did however introduce the issue of too high accuracy for the template matching as the image had to be a certain orientation and distance away for the match to be successful.</w:t>
+      </w:r>
+    </w:p>
+    <w:p>
+      <w:r>
+        <w:t xml:space="preserve">The next step was to check for rotations of the template at various scales. In a static image and in testing this worked perfectly and as expected, however with the live camera frames being matched against the various scales and rotations of the template, the video became </w:t>
+      </w:r>
+      <w:proofErr w:type="spellStart"/>
+      <w:r>
+        <w:t>stuttery</w:t>
+      </w:r>
+      <w:proofErr w:type="spellEnd"/>
+      <w:r>
+        <w:t xml:space="preserve"> and slow. The frame took time to be processed and as such the </w:t>
+      </w:r>
+      <w:proofErr w:type="spellStart"/>
+      <w:r>
+        <w:t>imshow</w:t>
+      </w:r>
+      <w:proofErr w:type="spellEnd"/>
+      <w:r>
+        <w:t xml:space="preserve"> command could only be done when the full set of matchings had been completed. </w:t>
+      </w:r>
+    </w:p>
+    <w:p>
+      <w:r>
+        <w:t>‘’’</w:t>
+      </w:r>
+    </w:p>
+    <w:p>
+      <w:r>
+        <w:t>DECIDED TO GO WITH JUST SCALE AND NOT ROTATION and control the rotation of the image for this project</w:t>
+      </w:r>
+      <w:r>
+        <w:t xml:space="preserve">, also output the scale from </w:t>
+      </w:r>
+      <w:proofErr w:type="spellStart"/>
+      <w:r>
+        <w:t>fuction</w:t>
+      </w:r>
+      <w:proofErr w:type="spellEnd"/>
+      <w:r>
+        <w:t xml:space="preserve"> so it can be used to estimate distance away from target in movement sections of the project</w:t>
+      </w:r>
+    </w:p>
+    <w:p>
+      <w:r>
+        <w:t>‘’’’</w:t>
       </w:r>
     </w:p>
     <w:p>
@@ -2033,6 +2174,32 @@
     </w:p>
     <w:p>
       <w:r>
+        <w:t>- printed out X to remove phone glare</w:t>
+      </w:r>
+    </w:p>
+    <w:p>
+      <w:r>
+        <w:t xml:space="preserve">- </w:t>
+      </w:r>
+      <w:proofErr w:type="spellStart"/>
+      <w:r>
+        <w:t>swappd</w:t>
+      </w:r>
+      <w:proofErr w:type="spellEnd"/>
+      <w:r>
+        <w:t xml:space="preserve"> template and image to cat face as the X had minimal detail making accuracy with thresholds </w:t>
+      </w:r>
+      <w:proofErr w:type="spellStart"/>
+      <w:r>
+        <w:t>diffucult</w:t>
+      </w:r>
+      <w:proofErr w:type="spellEnd"/>
+      <w:r>
+        <w:t xml:space="preserve"> to narrow down</w:t>
+      </w:r>
+    </w:p>
+    <w:p>
+      <w:r>
         <w:t>3. tested different algorithms</w:t>
       </w:r>
       <w:r>
@@ -2065,38 +2232,6 @@
       </w:r>
       <w:r>
         <w:t>”””</w:t>
-      </w:r>
-    </w:p>
-    <w:p>
-      <w:r>
-        <w:t>The template image is slid across the source image, one pixel at a time. At each position, a metric is calculated to measure how well the template matches that area of the source image. These metrics are stored in a result matrix, where the brightest locations (or darkest, depending on the method) indicate the best matches.</w:t>
-      </w:r>
-    </w:p>
-    <w:p>
-      <w:r>
-        <w:t>The function `</w:t>
-      </w:r>
-      <w:proofErr w:type="spellStart"/>
-      <w:r>
-        <w:t>minMaxLoc</w:t>
-      </w:r>
-      <w:proofErr w:type="spellEnd"/>
-      <w:r>
-        <w:t>()` is then used to find the highest (or lowest) value in the result matrix, identifying the location of the best match</w:t>
-      </w:r>
-    </w:p>
-    <w:p>
-      <w:r>
-        <w:lastRenderedPageBreak/>
-        <w:t>OpenCV's `</w:t>
-      </w:r>
-      <w:proofErr w:type="spellStart"/>
-      <w:r>
-        <w:t>matchTemplate</w:t>
-      </w:r>
-      <w:proofErr w:type="spellEnd"/>
-      <w:r>
-        <w:t>()` function offers six matching methods: `TM_SQDIFF`, `TM_SQDIFF_NORMED`, `TM_CCORR`, `TM_CCORR_NORMED`, `TM_CCOEFF`, and `TM_CCOEFF_NORMED`</w:t>
       </w:r>
     </w:p>
     <w:p>
@@ -2175,6 +2310,7 @@
       <w:bookmarkStart w:id="12" w:name="_Toc188629967"/>
       <w:commentRangeStart w:id="13"/>
       <w:r>
+        <w:lastRenderedPageBreak/>
         <w:t>5</w:t>
       </w:r>
       <w:r>
@@ -2275,113 +2411,116 @@
     </w:p>
     <w:p>
       <w:r>
+        <w:t>Chapter 5 image processing page 138</w:t>
+      </w:r>
+    </w:p>
+    <w:p>
+      <w:r>
+        <w:t>Chapter 7 histograms and matching 218</w:t>
+      </w:r>
+    </w:p>
+    <w:p>
+      <w:r>
+        <w:t>Chapter 8 page 254 moments</w:t>
+      </w:r>
+    </w:p>
+    <w:p>
+      <w:r>
+        <w:t xml:space="preserve">Chapter 10 </w:t>
+      </w:r>
+      <w:proofErr w:type="spellStart"/>
+      <w:r>
+        <w:t>pg</w:t>
+      </w:r>
+      <w:proofErr w:type="spellEnd"/>
+      <w:r>
+        <w:t xml:space="preserve"> 358 tracking and motion</w:t>
+      </w:r>
+    </w:p>
+    <w:p/>
+    <w:p>
+      <w:r>
+        <w:t xml:space="preserve">Z. Zhang and H. Shang, "Low-cost Solution for Vision-based Robotic Grasping," 2021 International Conference on Networking Systems of AI (INSAI), Shanghai, China, 2021, pp. 54-61, </w:t>
+      </w:r>
+      <w:proofErr w:type="spellStart"/>
+      <w:r>
+        <w:t>doi</w:t>
+      </w:r>
+      <w:proofErr w:type="spellEnd"/>
+      <w:r>
+        <w:t xml:space="preserve">: 10.1109/INSAI54028.2021.00022. keywords: {Location </w:t>
+      </w:r>
+      <w:proofErr w:type="spellStart"/>
+      <w:r>
+        <w:t>awareness;Service</w:t>
+      </w:r>
+      <w:proofErr w:type="spellEnd"/>
+      <w:r>
+        <w:t xml:space="preserve"> </w:t>
+      </w:r>
+      <w:proofErr w:type="spellStart"/>
+      <w:r>
+        <w:t>robots;Shape;Machine</w:t>
+      </w:r>
+      <w:proofErr w:type="spellEnd"/>
+      <w:r>
+        <w:t xml:space="preserve"> </w:t>
+      </w:r>
+      <w:proofErr w:type="spellStart"/>
+      <w:r>
+        <w:t>vision;Pose</w:t>
+      </w:r>
+      <w:proofErr w:type="spellEnd"/>
+      <w:r>
+        <w:t xml:space="preserve"> </w:t>
+      </w:r>
+      <w:proofErr w:type="spellStart"/>
+      <w:r>
+        <w:t>estimation;Grasping;Object</w:t>
+      </w:r>
+      <w:proofErr w:type="spellEnd"/>
+      <w:r>
+        <w:t xml:space="preserve"> </w:t>
+      </w:r>
+      <w:proofErr w:type="spellStart"/>
+      <w:r>
+        <w:t>detection;robotic</w:t>
+      </w:r>
+      <w:proofErr w:type="spellEnd"/>
+      <w:r>
+        <w:t xml:space="preserve"> </w:t>
+      </w:r>
+      <w:proofErr w:type="spellStart"/>
+      <w:r>
+        <w:t>grasping;machine</w:t>
+      </w:r>
+      <w:proofErr w:type="spellEnd"/>
+      <w:r>
+        <w:t xml:space="preserve"> </w:t>
+      </w:r>
+      <w:proofErr w:type="spellStart"/>
+      <w:r>
+        <w:t>vision;object</w:t>
+      </w:r>
+      <w:proofErr w:type="spellEnd"/>
+      <w:r>
+        <w:t xml:space="preserve"> </w:t>
+      </w:r>
+      <w:proofErr w:type="spellStart"/>
+      <w:r>
+        <w:t>localization;template</w:t>
+      </w:r>
+      <w:proofErr w:type="spellEnd"/>
+      <w:r>
+        <w:t xml:space="preserve"> matching},</w:t>
+      </w:r>
+    </w:p>
+    <w:p>
+      <w:r>
+        <w:rPr>
+          <w:noProof/>
+        </w:rPr>
         <w:lastRenderedPageBreak/>
-        <w:t>Chapter 5 image processing page 138</w:t>
-      </w:r>
-    </w:p>
-    <w:p>
-      <w:r>
-        <w:t>Chapter 7 histograms and matching 218</w:t>
-      </w:r>
-    </w:p>
-    <w:p>
-      <w:r>
-        <w:t>Chapter 8 page 254 moments</w:t>
-      </w:r>
-    </w:p>
-    <w:p>
-      <w:r>
-        <w:t xml:space="preserve">Chapter 10 </w:t>
-      </w:r>
-      <w:proofErr w:type="spellStart"/>
-      <w:r>
-        <w:t>pg</w:t>
-      </w:r>
-      <w:proofErr w:type="spellEnd"/>
-      <w:r>
-        <w:t xml:space="preserve"> 358 tracking and motion</w:t>
-      </w:r>
-    </w:p>
-    <w:p/>
-    <w:p>
-      <w:r>
-        <w:t xml:space="preserve">Z. Zhang and H. Shang, "Low-cost Solution for Vision-based Robotic Grasping," 2021 International Conference on Networking Systems of AI (INSAI), Shanghai, China, 2021, pp. 54-61, </w:t>
-      </w:r>
-      <w:proofErr w:type="spellStart"/>
-      <w:r>
-        <w:t>doi</w:t>
-      </w:r>
-      <w:proofErr w:type="spellEnd"/>
-      <w:r>
-        <w:t xml:space="preserve">: 10.1109/INSAI54028.2021.00022. keywords: {Location </w:t>
-      </w:r>
-      <w:proofErr w:type="spellStart"/>
-      <w:r>
-        <w:t>awareness;Service</w:t>
-      </w:r>
-      <w:proofErr w:type="spellEnd"/>
-      <w:r>
-        <w:t xml:space="preserve"> </w:t>
-      </w:r>
-      <w:proofErr w:type="spellStart"/>
-      <w:r>
-        <w:t>robots;Shape;Machine</w:t>
-      </w:r>
-      <w:proofErr w:type="spellEnd"/>
-      <w:r>
-        <w:t xml:space="preserve"> </w:t>
-      </w:r>
-      <w:proofErr w:type="spellStart"/>
-      <w:r>
-        <w:t>vision;Pose</w:t>
-      </w:r>
-      <w:proofErr w:type="spellEnd"/>
-      <w:r>
-        <w:t xml:space="preserve"> </w:t>
-      </w:r>
-      <w:proofErr w:type="spellStart"/>
-      <w:r>
-        <w:t>estimation;Grasping;Object</w:t>
-      </w:r>
-      <w:proofErr w:type="spellEnd"/>
-      <w:r>
-        <w:t xml:space="preserve"> </w:t>
-      </w:r>
-      <w:proofErr w:type="spellStart"/>
-      <w:r>
-        <w:t>detection;robotic</w:t>
-      </w:r>
-      <w:proofErr w:type="spellEnd"/>
-      <w:r>
-        <w:t xml:space="preserve"> </w:t>
-      </w:r>
-      <w:proofErr w:type="spellStart"/>
-      <w:r>
-        <w:t>grasping;machine</w:t>
-      </w:r>
-      <w:proofErr w:type="spellEnd"/>
-      <w:r>
-        <w:t xml:space="preserve"> </w:t>
-      </w:r>
-      <w:proofErr w:type="spellStart"/>
-      <w:r>
-        <w:t>vision;object</w:t>
-      </w:r>
-      <w:proofErr w:type="spellEnd"/>
-      <w:r>
-        <w:t xml:space="preserve"> </w:t>
-      </w:r>
-      <w:proofErr w:type="spellStart"/>
-      <w:r>
-        <w:t>localization;template</w:t>
-      </w:r>
-      <w:proofErr w:type="spellEnd"/>
-      <w:r>
-        <w:t xml:space="preserve"> matching},</w:t>
-      </w:r>
-    </w:p>
-    <w:p>
-      <w:r>
         <w:drawing>
           <wp:inline distT="0" distB="0" distL="0" distR="0" wp14:anchorId="1686873D" wp14:editId="3A598653">
             <wp:extent cx="5731510" cy="5087620"/>

</xml_diff>

<commit_message>
report edits and incl handbook
</commit_message>
<xml_diff>
--- a/Project Report in Progress.docx
+++ b/Project Report in Progress.docx
@@ -114,8 +114,8 @@
                                   <w:tblLook w:val="04A0" w:firstRow="1" w:lastRow="0" w:firstColumn="1" w:lastColumn="0" w:noHBand="0" w:noVBand="1"/>
                                 </w:tblPr>
                                 <w:tblGrid>
-                                  <w:gridCol w:w="5546"/>
-                                  <w:gridCol w:w="1975"/>
+                                  <w:gridCol w:w="5001"/>
+                                  <w:gridCol w:w="2281"/>
                                 </w:tblGrid>
                                 <w:tr>
                                   <w:trPr>
@@ -130,52 +130,6 @@
                                       <w:pPr>
                                         <w:jc w:val="right"/>
                                       </w:pPr>
-                                      <w:r>
-                                        <w:rPr>
-                                          <w:noProof/>
-                                        </w:rPr>
-                                        <w:drawing>
-                                          <wp:inline distT="0" distB="0" distL="0" distR="0" wp14:anchorId="0E6CAA8A" wp14:editId="6CA2F727">
-                                            <wp:extent cx="3065006" cy="3065006"/>
-                                            <wp:effectExtent l="0" t="0" r="0" b="0"/>
-                                            <wp:docPr id="139" name="Picture 137" descr="Beaver with solid fill"/>
-                                            <wp:cNvGraphicFramePr>
-                                              <a:graphicFrameLocks xmlns:a="http://schemas.openxmlformats.org/drawingml/2006/main" noChangeAspect="1"/>
-                                            </wp:cNvGraphicFramePr>
-                                            <a:graphic xmlns:a="http://schemas.openxmlformats.org/drawingml/2006/main">
-                                              <a:graphicData uri="http://schemas.openxmlformats.org/drawingml/2006/picture">
-                                                <pic:pic xmlns:pic="http://schemas.openxmlformats.org/drawingml/2006/picture">
-                                                  <pic:nvPicPr>
-                                                    <pic:cNvPr id="139" name="Picture 137" descr="Beaver with solid fill"/>
-                                                    <pic:cNvPicPr/>
-                                                  </pic:nvPicPr>
-                                                  <pic:blipFill>
-                                                    <a:blip r:embed="rId9">
-                                                      <a:extLst>
-                                                        <a:ext uri="{96DAC541-7B7A-43D3-8B79-37D633B846F1}">
-                                                          <asvg:svgBlip xmlns:asvg="http://schemas.microsoft.com/office/drawing/2016/SVG/main" r:embed="rId10"/>
-                                                        </a:ext>
-                                                      </a:extLst>
-                                                    </a:blip>
-                                                    <a:stretch>
-                                                      <a:fillRect/>
-                                                    </a:stretch>
-                                                  </pic:blipFill>
-                                                  <pic:spPr>
-                                                    <a:xfrm>
-                                                      <a:off x="0" y="0"/>
-                                                      <a:ext cx="3065006" cy="3065006"/>
-                                                    </a:xfrm>
-                                                    <a:prstGeom prst="rect">
-                                                      <a:avLst/>
-                                                    </a:prstGeom>
-                                                  </pic:spPr>
-                                                </pic:pic>
-                                              </a:graphicData>
-                                            </a:graphic>
-                                          </wp:inline>
-                                        </w:drawing>
-                                      </w:r>
                                     </w:p>
                                     <w:sdt>
                                       <w:sdtPr>
@@ -220,7 +174,6 @@
                                       <w:sdtPr>
                                         <w:rPr>
                                           <w:color w:val="000000" w:themeColor="text1"/>
-                                          <w:sz w:val="24"/>
                                           <w:szCs w:val="24"/>
                                         </w:rPr>
                                         <w:alias w:val="Subtitle"/>
@@ -234,14 +187,12 @@
                                           <w:pPr>
                                             <w:jc w:val="right"/>
                                             <w:rPr>
-                                              <w:sz w:val="24"/>
                                               <w:szCs w:val="24"/>
                                             </w:rPr>
                                           </w:pPr>
                                           <w:r>
                                             <w:rPr>
                                               <w:color w:val="000000" w:themeColor="text1"/>
-                                              <w:sz w:val="24"/>
                                               <w:szCs w:val="24"/>
                                             </w:rPr>
                                             <w:t>May 2025</w:t>
@@ -436,8 +387,8 @@
                             <w:tblLook w:val="04A0" w:firstRow="1" w:lastRow="0" w:firstColumn="1" w:lastColumn="0" w:noHBand="0" w:noVBand="1"/>
                           </w:tblPr>
                           <w:tblGrid>
-                            <w:gridCol w:w="5546"/>
-                            <w:gridCol w:w="1975"/>
+                            <w:gridCol w:w="5001"/>
+                            <w:gridCol w:w="2281"/>
                           </w:tblGrid>
                           <w:tr>
                             <w:trPr>
@@ -452,52 +403,6 @@
                                 <w:pPr>
                                   <w:jc w:val="right"/>
                                 </w:pPr>
-                                <w:r>
-                                  <w:rPr>
-                                    <w:noProof/>
-                                  </w:rPr>
-                                  <w:drawing>
-                                    <wp:inline distT="0" distB="0" distL="0" distR="0" wp14:anchorId="0E6CAA8A" wp14:editId="6CA2F727">
-                                      <wp:extent cx="3065006" cy="3065006"/>
-                                      <wp:effectExtent l="0" t="0" r="0" b="0"/>
-                                      <wp:docPr id="139" name="Picture 137" descr="Beaver with solid fill"/>
-                                      <wp:cNvGraphicFramePr>
-                                        <a:graphicFrameLocks xmlns:a="http://schemas.openxmlformats.org/drawingml/2006/main" noChangeAspect="1"/>
-                                      </wp:cNvGraphicFramePr>
-                                      <a:graphic xmlns:a="http://schemas.openxmlformats.org/drawingml/2006/main">
-                                        <a:graphicData uri="http://schemas.openxmlformats.org/drawingml/2006/picture">
-                                          <pic:pic xmlns:pic="http://schemas.openxmlformats.org/drawingml/2006/picture">
-                                            <pic:nvPicPr>
-                                              <pic:cNvPr id="139" name="Picture 137" descr="Beaver with solid fill"/>
-                                              <pic:cNvPicPr/>
-                                            </pic:nvPicPr>
-                                            <pic:blipFill>
-                                              <a:blip r:embed="rId9">
-                                                <a:extLst>
-                                                  <a:ext uri="{96DAC541-7B7A-43D3-8B79-37D633B846F1}">
-                                                    <asvg:svgBlip xmlns:asvg="http://schemas.microsoft.com/office/drawing/2016/SVG/main" r:embed="rId10"/>
-                                                  </a:ext>
-                                                </a:extLst>
-                                              </a:blip>
-                                              <a:stretch>
-                                                <a:fillRect/>
-                                              </a:stretch>
-                                            </pic:blipFill>
-                                            <pic:spPr>
-                                              <a:xfrm>
-                                                <a:off x="0" y="0"/>
-                                                <a:ext cx="3065006" cy="3065006"/>
-                                              </a:xfrm>
-                                              <a:prstGeom prst="rect">
-                                                <a:avLst/>
-                                              </a:prstGeom>
-                                            </pic:spPr>
-                                          </pic:pic>
-                                        </a:graphicData>
-                                      </a:graphic>
-                                    </wp:inline>
-                                  </w:drawing>
-                                </w:r>
                               </w:p>
                               <w:sdt>
                                 <w:sdtPr>
@@ -542,7 +447,6 @@
                                 <w:sdtPr>
                                   <w:rPr>
                                     <w:color w:val="000000" w:themeColor="text1"/>
-                                    <w:sz w:val="24"/>
                                     <w:szCs w:val="24"/>
                                   </w:rPr>
                                   <w:alias w:val="Subtitle"/>
@@ -556,14 +460,12 @@
                                     <w:pPr>
                                       <w:jc w:val="right"/>
                                       <w:rPr>
-                                        <w:sz w:val="24"/>
                                         <w:szCs w:val="24"/>
                                       </w:rPr>
                                     </w:pPr>
                                     <w:r>
                                       <w:rPr>
                                         <w:color w:val="000000" w:themeColor="text1"/>
-                                        <w:sz w:val="24"/>
                                         <w:szCs w:val="24"/>
                                       </w:rPr>
                                       <w:t>May 2025</w:t>
@@ -759,6 +661,7 @@
         <w:rPr>
           <w:b/>
           <w:bCs/>
+          <w:sz w:val="24"/>
         </w:rPr>
       </w:sdtEndPr>
       <w:sdtContent>
@@ -779,7 +682,6 @@
             <w:rPr>
               <w:rFonts w:eastAsiaTheme="minorEastAsia"/>
               <w:noProof/>
-              <w:sz w:val="24"/>
               <w:szCs w:val="24"/>
               <w:lang w:eastAsia="en-GB"/>
             </w:rPr>
@@ -860,7 +762,6 @@
             <w:rPr>
               <w:rFonts w:eastAsiaTheme="minorEastAsia"/>
               <w:noProof/>
-              <w:sz w:val="24"/>
               <w:szCs w:val="24"/>
               <w:lang w:eastAsia="en-GB"/>
             </w:rPr>
@@ -932,7 +833,6 @@
             <w:rPr>
               <w:rFonts w:eastAsiaTheme="minorEastAsia"/>
               <w:noProof/>
-              <w:sz w:val="24"/>
               <w:szCs w:val="24"/>
               <w:lang w:eastAsia="en-GB"/>
             </w:rPr>
@@ -1004,7 +904,6 @@
             <w:rPr>
               <w:rFonts w:eastAsiaTheme="minorEastAsia"/>
               <w:noProof/>
-              <w:sz w:val="24"/>
               <w:szCs w:val="24"/>
               <w:lang w:eastAsia="en-GB"/>
             </w:rPr>
@@ -1076,7 +975,6 @@
             <w:rPr>
               <w:rFonts w:eastAsiaTheme="minorEastAsia"/>
               <w:noProof/>
-              <w:sz w:val="24"/>
               <w:szCs w:val="24"/>
               <w:lang w:eastAsia="en-GB"/>
             </w:rPr>
@@ -1148,7 +1046,6 @@
             <w:rPr>
               <w:rFonts w:eastAsiaTheme="minorEastAsia"/>
               <w:noProof/>
-              <w:sz w:val="24"/>
               <w:szCs w:val="24"/>
               <w:lang w:eastAsia="en-GB"/>
             </w:rPr>
@@ -1220,7 +1117,6 @@
             <w:rPr>
               <w:rFonts w:eastAsiaTheme="minorEastAsia"/>
               <w:noProof/>
-              <w:sz w:val="24"/>
               <w:szCs w:val="24"/>
               <w:lang w:eastAsia="en-GB"/>
             </w:rPr>
@@ -1292,7 +1188,6 @@
             <w:rPr>
               <w:rFonts w:eastAsiaTheme="minorEastAsia"/>
               <w:noProof/>
-              <w:sz w:val="24"/>
               <w:szCs w:val="24"/>
               <w:lang w:eastAsia="en-GB"/>
             </w:rPr>
@@ -1364,7 +1259,6 @@
             <w:rPr>
               <w:rFonts w:eastAsiaTheme="minorEastAsia"/>
               <w:noProof/>
-              <w:sz w:val="24"/>
               <w:szCs w:val="24"/>
               <w:lang w:eastAsia="en-GB"/>
             </w:rPr>
@@ -1436,7 +1330,6 @@
             <w:rPr>
               <w:rFonts w:eastAsiaTheme="minorEastAsia"/>
               <w:noProof/>
-              <w:sz w:val="24"/>
               <w:szCs w:val="24"/>
               <w:lang w:eastAsia="en-GB"/>
             </w:rPr>
@@ -1508,7 +1401,6 @@
             <w:rPr>
               <w:rFonts w:eastAsiaTheme="minorEastAsia"/>
               <w:noProof/>
-              <w:sz w:val="24"/>
               <w:szCs w:val="24"/>
               <w:lang w:eastAsia="en-GB"/>
             </w:rPr>
@@ -1680,6 +1572,22 @@
       </w:r>
     </w:p>
     <w:p>
+      <w:r>
+        <w:rPr>
+          <w:rStyle w:val="normaltextrun"/>
+          <w:rFonts w:cs="Calibri"/>
+        </w:rPr>
+        <w:t>Raspberry Pi on mobile robot that can navigate a low obstacle controlled environment (such as search an empty cardboard box) pi communicates wirelessly</w:t>
+      </w:r>
+      <w:r>
+        <w:rPr>
+          <w:rStyle w:val="eop"/>
+          <w:rFonts w:cs="Calibri"/>
+        </w:rPr>
+        <w:t> </w:t>
+      </w:r>
+    </w:p>
+    <w:p>
       <w:pPr>
         <w:pStyle w:val="ListParagraph"/>
         <w:numPr>
@@ -1692,7 +1600,7 @@
           <w:rStyle w:val="normaltextrun"/>
           <w:rFonts w:cs="Calibri"/>
         </w:rPr>
-        <w:t>Raspberry Pi on mobile robot that can navigate a low obstacle controlled environment (such as search an empty cardboard box) pi communicates wirelessly</w:t>
+        <w:t>lower contrast target image/live feed target, more obstacles in environment</w:t>
       </w:r>
       <w:r>
         <w:rPr>
@@ -1715,7 +1623,7 @@
           <w:rStyle w:val="normaltextrun"/>
           <w:rFonts w:cs="Calibri"/>
         </w:rPr>
-        <w:t>lower contrast target image/live feed target, more obstacles in environment</w:t>
+        <w:t>little control in environment (multiple obstacles and targets not on high contrast surfaces, and no physical barriers) </w:t>
       </w:r>
       <w:r>
         <w:rPr>
@@ -1738,7 +1646,7 @@
           <w:rStyle w:val="normaltextrun"/>
           <w:rFonts w:cs="Calibri"/>
         </w:rPr>
-        <w:t>little control in environment (multiple obstacles and targets not on high contrast surfaces, and no physical barriers) </w:t>
+        <w:t>Extra goal if time or to continue working on after project timeframe: Pi Map out specific objects in an environment, feed in multiple targets in specific order, robot correctly goes to each target in order.</w:t>
       </w:r>
       <w:r>
         <w:rPr>
@@ -1748,20 +1656,36 @@
         <w:t> </w:t>
       </w:r>
     </w:p>
-    <w:p>
-      <w:pPr>
-        <w:pStyle w:val="ListParagraph"/>
-        <w:numPr>
-          <w:ilvl w:val="0"/>
-          <w:numId w:val="8"/>
-        </w:numPr>
-      </w:pPr>
-      <w:r>
+    <w:p/>
+    <w:p>
+      <w:pPr>
         <w:rPr>
           <w:rStyle w:val="normaltextrun"/>
           <w:rFonts w:cs="Calibri"/>
         </w:rPr>
-        <w:t>Extra goal if time or to continue working on after project timeframe: Pi Map out specific objects in an environment, feed in multiple targets in specific order, robot correctly goes to each target in order.</w:t>
+      </w:pPr>
+      <w:r>
+        <w:rPr>
+          <w:rStyle w:val="normaltextrun"/>
+          <w:rFonts w:cs="Calibri"/>
+        </w:rPr>
+        <w:t>Quotes from project proposal:</w:t>
+      </w:r>
+    </w:p>
+    <w:p>
+      <w:pPr>
+        <w:pStyle w:val="ListParagraph"/>
+        <w:numPr>
+          <w:ilvl w:val="0"/>
+          <w:numId w:val="9"/>
+        </w:numPr>
+      </w:pPr>
+      <w:r>
+        <w:rPr>
+          <w:rStyle w:val="normaltextrun"/>
+          <w:rFonts w:cs="Calibri"/>
+        </w:rPr>
+        <w:t>High Focus on image comparison,</w:t>
       </w:r>
       <w:r>
         <w:rPr>
@@ -1771,22 +1695,6 @@
         <w:t> </w:t>
       </w:r>
     </w:p>
-    <w:p/>
-    <w:p>
-      <w:pPr>
-        <w:rPr>
-          <w:rStyle w:val="normaltextrun"/>
-          <w:rFonts w:cs="Calibri"/>
-        </w:rPr>
-      </w:pPr>
-      <w:r>
-        <w:rPr>
-          <w:rStyle w:val="normaltextrun"/>
-          <w:rFonts w:cs="Calibri"/>
-        </w:rPr>
-        <w:t>Quotes from project proposal:</w:t>
-      </w:r>
-    </w:p>
     <w:p>
       <w:pPr>
         <w:pStyle w:val="ListParagraph"/>
@@ -1800,7 +1708,7 @@
           <w:rStyle w:val="normaltextrun"/>
           <w:rFonts w:cs="Calibri"/>
         </w:rPr>
-        <w:t>High Focus on image comparison,</w:t>
+        <w:t>Medium focus on autonomous movement</w:t>
       </w:r>
       <w:r>
         <w:rPr>
@@ -1823,7 +1731,8 @@
           <w:rStyle w:val="normaltextrun"/>
           <w:rFonts w:cs="Calibri"/>
         </w:rPr>
-        <w:t>Medium focus on autonomous movement</w:t>
+        <w:lastRenderedPageBreak/>
+        <w:t>There will be a laptop that wireless communicates with an autonomous mobile robot. Feed it an image either pre-selected or through the laptop webcam (as a stretch goal)</w:t>
       </w:r>
       <w:r>
         <w:rPr>
@@ -1846,30 +1755,6 @@
           <w:rStyle w:val="normaltextrun"/>
           <w:rFonts w:cs="Calibri"/>
         </w:rPr>
-        <w:t>There will be a laptop that wireless communicates with an autonomous mobile robot. Feed it an image either pre-selected or through the laptop webcam (as a stretch goal)</w:t>
-      </w:r>
-      <w:r>
-        <w:rPr>
-          <w:rStyle w:val="eop"/>
-          <w:rFonts w:cs="Calibri"/>
-        </w:rPr>
-        <w:t> </w:t>
-      </w:r>
-    </w:p>
-    <w:p>
-      <w:pPr>
-        <w:pStyle w:val="ListParagraph"/>
-        <w:numPr>
-          <w:ilvl w:val="0"/>
-          <w:numId w:val="9"/>
-        </w:numPr>
-      </w:pPr>
-      <w:r>
-        <w:rPr>
-          <w:rStyle w:val="normaltextrun"/>
-          <w:rFonts w:cs="Calibri"/>
-        </w:rPr>
-        <w:lastRenderedPageBreak/>
         <w:t>This will start with a high contrast simple shape on a plain background, and if successful, lower contrast or busier images can be used.</w:t>
       </w:r>
       <w:r>
@@ -1940,7 +1825,7 @@
                     </pic:cNvPicPr>
                   </pic:nvPicPr>
                   <pic:blipFill>
-                    <a:blip r:embed="rId11">
+                    <a:blip r:embed="rId9">
                       <a:extLst>
                         <a:ext uri="{28A0092B-C50C-407E-A947-70E740481C1C}">
                           <a14:useLocalDpi xmlns:a14="http://schemas.microsoft.com/office/drawing/2010/main" val="0"/>
@@ -2066,6 +1951,7 @@
     </w:p>
     <w:p>
       <w:r>
+        <w:lastRenderedPageBreak/>
         <w:t>OpenCV's `</w:t>
       </w:r>
       <w:proofErr w:type="spellStart"/>
@@ -2084,28 +1970,54 @@
     </w:p>
     <w:p>
       <w:r>
-        <w:lastRenderedPageBreak/>
-        <w:t xml:space="preserve">Initially the template image and image including the template was a big black X on a white sheet of paper, chosen with the understanding that the high contrast and simple shape would make the code simpler and cleaner. This </w:t>
-      </w:r>
-      <w:r>
+        <w:t>Initially the template image and image including the template was a big black X on a white sheet of paper, chosen with the understanding that the high contrast and simple shape would make the code simpler and cleaner</w:t>
+      </w:r>
+      <w:r>
+        <w:rPr>
+          <w:strike/>
+        </w:rPr>
+        <w:t xml:space="preserve">. This </w:t>
+      </w:r>
+      <w:r>
+        <w:rPr>
+          <w:strike/>
+        </w:rPr>
         <w:t xml:space="preserve">did </w:t>
       </w:r>
       <w:r>
+        <w:rPr>
+          <w:strike/>
+        </w:rPr>
         <w:t>allow</w:t>
       </w:r>
       <w:r>
+        <w:rPr>
+          <w:strike/>
+        </w:rPr>
         <w:t xml:space="preserve"> </w:t>
       </w:r>
       <w:r>
+        <w:rPr>
+          <w:strike/>
+        </w:rPr>
         <w:t>the image to be found easily however it also introduced more false positives in the surrounding environment</w:t>
       </w:r>
       <w:r>
+        <w:rPr>
+          <w:strike/>
+        </w:rPr>
         <w:t>. it</w:t>
       </w:r>
       <w:r>
+        <w:rPr>
+          <w:strike/>
+        </w:rPr>
         <w:t xml:space="preserve"> was very difficult to narrow the accuracy threshold</w:t>
       </w:r>
       <w:r>
+        <w:rPr>
+          <w:strike/>
+        </w:rPr>
         <w:t xml:space="preserve"> to a point where the shape would still be found and false positives where uncommon</w:t>
       </w:r>
       <w:r>
@@ -2241,6 +2153,7 @@
       </w:pPr>
       <w:bookmarkStart w:id="6" w:name="_Toc188629963"/>
       <w:r>
+        <w:lastRenderedPageBreak/>
         <w:t>2.2 Mobility of Robot</w:t>
       </w:r>
       <w:bookmarkEnd w:id="6"/>
@@ -2310,7 +2223,6 @@
       <w:bookmarkStart w:id="12" w:name="_Toc188629967"/>
       <w:commentRangeStart w:id="13"/>
       <w:r>
-        <w:lastRenderedPageBreak/>
         <w:t>5</w:t>
       </w:r>
       <w:r>
@@ -2388,7 +2300,7 @@
                     <pic:cNvPicPr/>
                   </pic:nvPicPr>
                   <pic:blipFill>
-                    <a:blip r:embed="rId16"/>
+                    <a:blip r:embed="rId14"/>
                     <a:stretch>
                       <a:fillRect/>
                     </a:stretch>
@@ -2426,6 +2338,7 @@
     </w:p>
     <w:p>
       <w:r>
+        <w:lastRenderedPageBreak/>
         <w:t xml:space="preserve">Chapter 10 </w:t>
       </w:r>
       <w:proofErr w:type="spellStart"/>
@@ -2520,7 +2433,6 @@
         <w:rPr>
           <w:noProof/>
         </w:rPr>
-        <w:lastRenderedPageBreak/>
         <w:drawing>
           <wp:inline distT="0" distB="0" distL="0" distR="0" wp14:anchorId="1686873D" wp14:editId="3A598653">
             <wp:extent cx="5731510" cy="5087620"/>
@@ -2537,7 +2449,7 @@
                     <pic:cNvPicPr/>
                   </pic:nvPicPr>
                   <pic:blipFill>
-                    <a:blip r:embed="rId17"/>
+                    <a:blip r:embed="rId15"/>
                     <a:stretch>
                       <a:fillRect/>
                     </a:stretch>
@@ -2559,6 +2471,7 @@
       </w:r>
     </w:p>
     <w:sectPr>
+      <w:footerReference w:type="default" r:id="rId16"/>
       <w:pgSz w:w="11906" w:h="16838"/>
       <w:pgMar w:top="1440" w:right="1440" w:bottom="1440" w:left="1440" w:header="708" w:footer="708" w:gutter="0"/>
       <w:pgNumType w:start="0"/>
@@ -2910,6 +2823,48 @@
     </w:p>
   </w:endnote>
 </w:endnotes>
+</file>
+
+<file path=word/footer1.xml><?xml version="1.0" encoding="utf-8"?>
+<w:ftr xmlns:wpc="http://schemas.microsoft.com/office/word/2010/wordprocessingCanvas" xmlns:cx="http://schemas.microsoft.com/office/drawing/2014/chartex" xmlns:cx1="http://schemas.microsoft.com/office/drawing/2015/9/8/chartex" xmlns:cx2="http://schemas.microsoft.com/office/drawing/2015/10/21/chartex" xmlns:cx3="http://schemas.microsoft.com/office/drawing/2016/5/9/chartex" xmlns:cx4="http://schemas.microsoft.com/office/drawing/2016/5/10/chartex" xmlns:cx5="http://schemas.microsoft.com/office/drawing/2016/5/11/chartex" xmlns:cx6="http://schemas.microsoft.com/office/drawing/2016/5/12/chartex" xmlns:cx7="http://schemas.microsoft.com/office/drawing/2016/5/13/chartex" xmlns:cx8="http://schemas.microsoft.com/office/drawing/2016/5/14/chartex" xmlns:mc="http://schemas.openxmlformats.org/markup-compatibility/2006" xmlns:aink="http://schemas.microsoft.com/office/drawing/2016/ink" xmlns:am3d="http://schemas.microsoft.com/office/drawing/2017/model3d" xmlns:o="urn:schemas-microsoft-com:office:office" xmlns:oel="http://schemas.microsoft.com/office/2019/extlst" xmlns:r="http://schemas.openxmlformats.org/officeDocument/2006/relationships" xmlns:m="http://schemas.openxmlformats.org/officeDocument/2006/math" xmlns:v="urn:schemas-microsoft-com:vml" xmlns:wp14="http://schemas.microsoft.com/office/word/2010/wordprocessingDrawing" xmlns:wp="http://schemas.openxmlformats.org/drawingml/2006/wordprocessingDrawing" xmlns:w10="urn:schemas-microsoft-com:office:word" xmlns:w="http://schemas.openxmlformats.org/wordprocessingml/2006/main" xmlns:w14="http://schemas.microsoft.com/office/word/2010/wordml" xmlns:w15="http://schemas.microsoft.com/office/word/2012/wordml" xmlns:w16cex="http://schemas.microsoft.com/office/word/2018/wordml/cex" xmlns:w16cid="http://schemas.microsoft.com/office/word/2016/wordml/cid" xmlns:w16="http://schemas.microsoft.com/office/word/2018/wordml" xmlns:w16du="http://schemas.microsoft.com/office/word/2023/wordml/word16du" xmlns:w16sdtdh="http://schemas.microsoft.com/office/word/2020/wordml/sdtdatahash" xmlns:w16sdtfl="http://schemas.microsoft.com/office/word/2024/wordml/sdtformatlock" xmlns:w16se="http://schemas.microsoft.com/office/word/2015/wordml/symex" xmlns:wpg="http://schemas.microsoft.com/office/word/2010/wordprocessingGroup" xmlns:wpi="http://schemas.microsoft.com/office/word/2010/wordprocessingInk" xmlns:wne="http://schemas.microsoft.com/office/word/2006/wordml" xmlns:wps="http://schemas.microsoft.com/office/word/2010/wordprocessingShape" mc:Ignorable="w14 w15 w16se w16cid w16 w16cex w16sdtdh w16sdtfl w16du wp14">
+  <w:sdt>
+    <w:sdtPr>
+      <w:id w:val="-949395913"/>
+      <w:docPartObj>
+        <w:docPartGallery w:val="Page Numbers (Bottom of Page)"/>
+        <w:docPartUnique/>
+      </w:docPartObj>
+    </w:sdtPr>
+    <w:sdtContent>
+      <w:p>
+        <w:pPr>
+          <w:pStyle w:val="Footer"/>
+          <w:jc w:val="center"/>
+        </w:pPr>
+        <w:r>
+          <w:fldChar w:fldCharType="begin"/>
+        </w:r>
+        <w:r>
+          <w:instrText>PAGE   \* MERGEFORMAT</w:instrText>
+        </w:r>
+        <w:r>
+          <w:fldChar w:fldCharType="separate"/>
+        </w:r>
+        <w:r>
+          <w:t>2</w:t>
+        </w:r>
+        <w:r>
+          <w:fldChar w:fldCharType="end"/>
+        </w:r>
+      </w:p>
+    </w:sdtContent>
+  </w:sdt>
+  <w:p>
+    <w:pPr>
+      <w:pStyle w:val="Footer"/>
+    </w:pPr>
+  </w:p>
+</w:ftr>
 </file>
 
 <file path=word/footnotes.xml><?xml version="1.0" encoding="utf-8"?>
@@ -4558,6 +4513,13 @@
   <w:style w:type="paragraph" w:default="1" w:styleId="Normal">
     <w:name w:val="Normal"/>
     <w:qFormat/>
+    <w:rsid w:val="00B36032"/>
+    <w:pPr>
+      <w:spacing w:before="120" w:after="120"/>
+    </w:pPr>
+    <w:rPr>
+      <w:sz w:val="24"/>
+    </w:rPr>
   </w:style>
   <w:style w:type="paragraph" w:styleId="Heading1">
     <w:name w:val="heading 1"/>
@@ -5275,7 +5237,6 @@
     <w:rPr>
       <w:rFonts w:ascii="Times New Roman" w:eastAsia="Times New Roman" w:hAnsi="Times New Roman" w:cs="Times New Roman"/>
       <w:kern w:val="0"/>
-      <w:sz w:val="24"/>
       <w:szCs w:val="24"/>
       <w:lang w:eastAsia="en-GB"/>
       <w14:ligatures w14:val="none"/>
@@ -5340,67 +5301,15 @@
         <a:srgbClr val="666699"/>
       </a:folHlink>
     </a:clrScheme>
-    <a:fontScheme name="Office 2013 - 2022">
+    <a:fontScheme name="Arial">
       <a:majorFont>
-        <a:latin typeface="Calibri Light" panose="020F0302020204030204"/>
+        <a:latin typeface="Arial" panose="020B0604020202020204"/>
         <a:ea typeface=""/>
         <a:cs typeface=""/>
-        <a:font script="Jpan" typeface="游ゴシック Light"/>
-        <a:font script="Hang" typeface="맑은 고딕"/>
-        <a:font script="Hans" typeface="等线 Light"/>
-        <a:font script="Hant" typeface="新細明體"/>
-        <a:font script="Arab" typeface="Times New Roman"/>
-        <a:font script="Hebr" typeface="Times New Roman"/>
-        <a:font script="Thai" typeface="Angsana New"/>
-        <a:font script="Ethi" typeface="Nyala"/>
-        <a:font script="Beng" typeface="Vrinda"/>
-        <a:font script="Gujr" typeface="Shruti"/>
-        <a:font script="Khmr" typeface="MoolBoran"/>
-        <a:font script="Knda" typeface="Tunga"/>
-        <a:font script="Guru" typeface="Raavi"/>
-        <a:font script="Cans" typeface="Euphemia"/>
-        <a:font script="Cher" typeface="Plantagenet Cherokee"/>
-        <a:font script="Yiii" typeface="Microsoft Yi Baiti"/>
-        <a:font script="Tibt" typeface="Microsoft Himalaya"/>
-        <a:font script="Thaa" typeface="MV Boli"/>
-        <a:font script="Deva" typeface="Mangal"/>
-        <a:font script="Telu" typeface="Gautami"/>
-        <a:font script="Taml" typeface="Latha"/>
-        <a:font script="Syrc" typeface="Estrangelo Edessa"/>
-        <a:font script="Orya" typeface="Kalinga"/>
-        <a:font script="Mlym" typeface="Kartika"/>
-        <a:font script="Laoo" typeface="DokChampa"/>
-        <a:font script="Sinh" typeface="Iskoola Pota"/>
-        <a:font script="Mong" typeface="Mongolian Baiti"/>
-        <a:font script="Viet" typeface="Times New Roman"/>
-        <a:font script="Uigh" typeface="Microsoft Uighur"/>
-        <a:font script="Geor" typeface="Sylfaen"/>
-        <a:font script="Armn" typeface="Arial"/>
-        <a:font script="Bugi" typeface="Leelawadee UI"/>
-        <a:font script="Bopo" typeface="Microsoft JhengHei"/>
-        <a:font script="Java" typeface="Javanese Text"/>
-        <a:font script="Lisu" typeface="Segoe UI"/>
-        <a:font script="Mymr" typeface="Myanmar Text"/>
-        <a:font script="Nkoo" typeface="Ebrima"/>
-        <a:font script="Olck" typeface="Nirmala UI"/>
-        <a:font script="Osma" typeface="Ebrima"/>
-        <a:font script="Phag" typeface="Phagspa"/>
-        <a:font script="Syrn" typeface="Estrangelo Edessa"/>
-        <a:font script="Syrj" typeface="Estrangelo Edessa"/>
-        <a:font script="Syre" typeface="Estrangelo Edessa"/>
-        <a:font script="Sora" typeface="Nirmala UI"/>
-        <a:font script="Tale" typeface="Microsoft Tai Le"/>
-        <a:font script="Talu" typeface="Microsoft New Tai Lue"/>
-        <a:font script="Tfng" typeface="Ebrima"/>
-      </a:majorFont>
-      <a:minorFont>
-        <a:latin typeface="Calibri" panose="020F0502020204030204"/>
-        <a:ea typeface=""/>
-        <a:cs typeface=""/>
-        <a:font script="Jpan" typeface="游明朝"/>
-        <a:font script="Hang" typeface="맑은 고딕"/>
-        <a:font script="Hans" typeface="等线"/>
-        <a:font script="Hant" typeface="新細明體"/>
+        <a:font script="Jpan" typeface="ＭＳ Ｐゴシック"/>
+        <a:font script="Hang" typeface="굴림"/>
+        <a:font script="Hans" typeface="黑体"/>
+        <a:font script="Hant" typeface="微軟正黑體"/>
         <a:font script="Arab" typeface="Arial"/>
         <a:font script="Hebr" typeface="Arial"/>
         <a:font script="Thai" typeface="Cordia New"/>
@@ -5427,23 +5336,41 @@
         <a:font script="Viet" typeface="Arial"/>
         <a:font script="Uigh" typeface="Microsoft Uighur"/>
         <a:font script="Geor" typeface="Sylfaen"/>
-        <a:font script="Armn" typeface="Arial"/>
-        <a:font script="Bugi" typeface="Leelawadee UI"/>
-        <a:font script="Bopo" typeface="Microsoft JhengHei"/>
-        <a:font script="Java" typeface="Javanese Text"/>
-        <a:font script="Lisu" typeface="Segoe UI"/>
-        <a:font script="Mymr" typeface="Myanmar Text"/>
-        <a:font script="Nkoo" typeface="Ebrima"/>
-        <a:font script="Olck" typeface="Nirmala UI"/>
-        <a:font script="Osma" typeface="Ebrima"/>
-        <a:font script="Phag" typeface="Phagspa"/>
-        <a:font script="Syrn" typeface="Estrangelo Edessa"/>
-        <a:font script="Syrj" typeface="Estrangelo Edessa"/>
-        <a:font script="Syre" typeface="Estrangelo Edessa"/>
-        <a:font script="Sora" typeface="Nirmala UI"/>
-        <a:font script="Tale" typeface="Microsoft Tai Le"/>
-        <a:font script="Talu" typeface="Microsoft New Tai Lue"/>
-        <a:font script="Tfng" typeface="Ebrima"/>
+      </a:majorFont>
+      <a:minorFont>
+        <a:latin typeface="Arial" panose="020B0604020202020204"/>
+        <a:ea typeface=""/>
+        <a:cs typeface=""/>
+        <a:font script="Jpan" typeface="ＭＳ Ｐゴシック"/>
+        <a:font script="Hang" typeface="굴림"/>
+        <a:font script="Hans" typeface="黑体"/>
+        <a:font script="Hant" typeface="微軟正黑體"/>
+        <a:font script="Arab" typeface="Arial"/>
+        <a:font script="Hebr" typeface="Arial"/>
+        <a:font script="Thai" typeface="Cordia New"/>
+        <a:font script="Ethi" typeface="Nyala"/>
+        <a:font script="Beng" typeface="Vrinda"/>
+        <a:font script="Gujr" typeface="Shruti"/>
+        <a:font script="Khmr" typeface="DaunPenh"/>
+        <a:font script="Knda" typeface="Tunga"/>
+        <a:font script="Guru" typeface="Raavi"/>
+        <a:font script="Cans" typeface="Euphemia"/>
+        <a:font script="Cher" typeface="Plantagenet Cherokee"/>
+        <a:font script="Yiii" typeface="Microsoft Yi Baiti"/>
+        <a:font script="Tibt" typeface="Microsoft Himalaya"/>
+        <a:font script="Thaa" typeface="MV Boli"/>
+        <a:font script="Deva" typeface="Mangal"/>
+        <a:font script="Telu" typeface="Gautami"/>
+        <a:font script="Taml" typeface="Latha"/>
+        <a:font script="Syrc" typeface="Estrangelo Edessa"/>
+        <a:font script="Orya" typeface="Kalinga"/>
+        <a:font script="Mlym" typeface="Kartika"/>
+        <a:font script="Laoo" typeface="DokChampa"/>
+        <a:font script="Sinh" typeface="Iskoola Pota"/>
+        <a:font script="Mong" typeface="Mongolian Baiti"/>
+        <a:font script="Viet" typeface="Arial"/>
+        <a:font script="Uigh" typeface="Microsoft Uighur"/>
+        <a:font script="Geor" typeface="Sylfaen"/>
       </a:minorFont>
     </a:fontScheme>
     <a:fmtScheme name="Office">

</xml_diff>